<commit_message>
Added DFD in PG2
</commit_message>
<xml_diff>
--- a/Presentation_Reports/Group_09_Progress_report_2.docx
+++ b/Presentation_Reports/Group_09_Progress_report_2.docx
@@ -1,6 +1,6 @@
 
 <file path=word/document.xml><?xml version="1.0" encoding="utf-8"?>
-<w:document xmlns:wpc="http://schemas.microsoft.com/office/word/2010/wordprocessingCanvas" xmlns:cx="http://schemas.microsoft.com/office/drawing/2014/chartex" xmlns:cx1="http://schemas.microsoft.com/office/drawing/2015/9/8/chartex" xmlns:cx2="http://schemas.microsoft.com/office/drawing/2015/10/21/chartex" xmlns:cx3="http://schemas.microsoft.com/office/drawing/2016/5/9/chartex" xmlns:cx4="http://schemas.microsoft.com/office/drawing/2016/5/10/chartex" xmlns:cx5="http://schemas.microsoft.com/office/drawing/2016/5/11/chartex" xmlns:cx6="http://schemas.microsoft.com/office/drawing/2016/5/12/chartex" xmlns:cx7="http://schemas.microsoft.com/office/drawing/2016/5/13/chartex" xmlns:cx8="http://schemas.microsoft.com/office/drawing/2016/5/14/chartex" xmlns:mc="http://schemas.openxmlformats.org/markup-compatibility/2006" xmlns:aink="http://schemas.microsoft.com/office/drawing/2016/ink" xmlns:am3d="http://schemas.microsoft.com/office/drawing/2017/model3d" xmlns:o="urn:schemas-microsoft-com:office:office" xmlns:oel="http://schemas.microsoft.com/office/2019/extlst" xmlns:r="http://schemas.openxmlformats.org/officeDocument/2006/relationships" xmlns:m="http://schemas.openxmlformats.org/officeDocument/2006/math" xmlns:v="urn:schemas-microsoft-com:vml" xmlns:wp14="http://schemas.microsoft.com/office/word/2010/wordprocessingDrawing" xmlns:wp="http://schemas.openxmlformats.org/drawingml/2006/wordprocessingDrawing" xmlns:w10="urn:schemas-microsoft-com:office:word" xmlns:w="http://schemas.openxmlformats.org/wordprocessingml/2006/main" xmlns:w14="http://schemas.microsoft.com/office/word/2010/wordml" xmlns:w15="http://schemas.microsoft.com/office/word/2012/wordml" xmlns:w16cex="http://schemas.microsoft.com/office/word/2018/wordml/cex" xmlns:w16cid="http://schemas.microsoft.com/office/word/2016/wordml/cid" xmlns:w16="http://schemas.microsoft.com/office/word/2018/wordml" xmlns:w16du="http://schemas.microsoft.com/office/word/2023/wordml/word16du" xmlns:w16sdtdh="http://schemas.microsoft.com/office/word/2020/wordml/sdtdatahash" xmlns:w16sdtfl="http://schemas.microsoft.com/office/word/2024/wordml/sdtformatlock" xmlns:w16se="http://schemas.microsoft.com/office/word/2015/wordml/symex" xmlns:wpg="http://schemas.microsoft.com/office/word/2010/wordprocessingGroup" xmlns:wpi="http://schemas.microsoft.com/office/word/2010/wordprocessingInk" xmlns:wne="http://schemas.microsoft.com/office/word/2006/wordml" xmlns:wps="http://schemas.microsoft.com/office/word/2010/wordprocessingShape" mc:Ignorable="w14 w15 w16se w16cid w16 w16cex w16sdtdh w16sdtfl w16du wp14">
+<w:document xmlns:wpc="http://schemas.microsoft.com/office/word/2010/wordprocessingCanvas" xmlns:cx="http://schemas.microsoft.com/office/drawing/2014/chartex" xmlns:cx1="http://schemas.microsoft.com/office/drawing/2015/9/8/chartex" xmlns:cx2="http://schemas.microsoft.com/office/drawing/2015/10/21/chartex" xmlns:cx3="http://schemas.microsoft.com/office/drawing/2016/5/9/chartex" xmlns:cx4="http://schemas.microsoft.com/office/drawing/2016/5/10/chartex" xmlns:cx5="http://schemas.microsoft.com/office/drawing/2016/5/11/chartex" xmlns:cx6="http://schemas.microsoft.com/office/drawing/2016/5/12/chartex" xmlns:cx7="http://schemas.microsoft.com/office/drawing/2016/5/13/chartex" xmlns:cx8="http://schemas.microsoft.com/office/drawing/2016/5/14/chartex" xmlns:mc="http://schemas.openxmlformats.org/markup-compatibility/2006" xmlns:aink="http://schemas.microsoft.com/office/drawing/2016/ink" xmlns:am3d="http://schemas.microsoft.com/office/drawing/2017/model3d" xmlns:o="urn:schemas-microsoft-com:office:office" xmlns:oel="http://schemas.microsoft.com/office/2019/extlst" xmlns:r="http://schemas.openxmlformats.org/officeDocument/2006/relationships" xmlns:m="http://schemas.openxmlformats.org/officeDocument/2006/math" xmlns:v="urn:schemas-microsoft-com:vml" xmlns:wp14="http://schemas.microsoft.com/office/word/2010/wordprocessingDrawing" xmlns:wp="http://schemas.openxmlformats.org/drawingml/2006/wordprocessingDrawing" xmlns:w10="urn:schemas-microsoft-com:office:word" xmlns:w="http://schemas.openxmlformats.org/wordprocessingml/2006/main" xmlns:w14="http://schemas.microsoft.com/office/word/2010/wordml" xmlns:w15="http://schemas.microsoft.com/office/word/2012/wordml" xmlns:w16cei="http://schemas.microsoft.com/office/word/2026/wordml/cei" xmlns:w16cex="http://schemas.microsoft.com/office/word/2018/wordml/cex" xmlns:w16cid="http://schemas.microsoft.com/office/word/2016/wordml/cid" xmlns:w16="http://schemas.microsoft.com/office/word/2018/wordml" xmlns:w16du="http://schemas.microsoft.com/office/word/2023/wordml/word16du" xmlns:w16sdtdh="http://schemas.microsoft.com/office/word/2020/wordml/sdtdatahash" xmlns:w16sdtfl="http://schemas.microsoft.com/office/word/2024/wordml/sdtformatlock" xmlns:w16se="http://schemas.microsoft.com/office/word/2015/wordml/symex" xmlns:wpg="http://schemas.microsoft.com/office/word/2010/wordprocessingGroup" xmlns:wpi="http://schemas.microsoft.com/office/word/2010/wordprocessingInk" xmlns:wne="http://schemas.microsoft.com/office/word/2006/wordml" xmlns:wps="http://schemas.microsoft.com/office/word/2010/wordprocessingShape" mc:Ignorable="w14 w15 w16se w16cid w16 w16cex w16sdtdh w16sdtfl w16du wp14">
   <w:body>
     <w:p>
       <w:pPr>
@@ -287,7 +287,7 @@
           </mc:Choice>
           <mc:Fallback>
             <w:pict>
-              <v:line w14:anchorId="2754B3B8" id="Straight Connector 2" o:spid="_x0000_s1026" style="position:absolute;flip:y;z-index:251699200;visibility:visible;mso-wrap-style:square;mso-width-percent:0;mso-height-percent:0;mso-wrap-distance-left:9pt;mso-wrap-distance-top:0;mso-wrap-distance-right:9pt;mso-wrap-distance-bottom:0;mso-position-horizontal:absolute;mso-position-horizontal-relative:text;mso-position-vertical:absolute;mso-position-vertical-relative:text;mso-width-percent:0;mso-height-percent:0;mso-width-relative:margin;mso-height-relative:margin" from="0,4pt" to="450pt,4pt" o:gfxdata="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" strokecolor="black [3213]" strokeweight="1.5pt"/>
+              <v:line w14:anchorId="2754B3B8" id="Straight Connector 2" o:spid="_x0000_s1026" style="position:absolute;flip:y;z-index:251699200;visibility:visible;mso-wrap-style:square;mso-width-percent:0;mso-height-percent:0;mso-wrap-distance-left:9pt;mso-wrap-distance-top:0;mso-wrap-distance-right:9pt;mso-wrap-distance-bottom:0;mso-position-horizontal:absolute;mso-position-horizontal-relative:text;mso-position-vertical:absolute;mso-position-vertical-relative:text;mso-width-percent:0;mso-height-percent:0;mso-width-relative:margin;mso-height-relative:margin" from="0,4pt" to="450pt,4pt" o:gfxdata="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" strokecolor="black [3213]" strokeweight="1.5pt"/>
             </w:pict>
           </mc:Fallback>
         </mc:AlternateContent>
@@ -1073,7 +1073,7 @@
                 <v:stroke joinstyle="miter"/>
                 <v:path gradientshapeok="t" o:connecttype="rect"/>
               </v:shapetype>
-              <v:shape id="Text Box 1" o:spid="_x0000_s1026" type="#_x0000_t202" style="position:absolute;left:0;text-align:left;margin-left:81.15pt;margin-top:644.95pt;width:288.9pt;height:.05pt;z-index:251723776;visibility:visible;mso-wrap-style:square;mso-wrap-distance-left:9pt;mso-wrap-distance-top:0;mso-wrap-distance-right:9pt;mso-wrap-distance-bottom:0;mso-position-horizontal:absolute;mso-position-horizontal-relative:text;mso-position-vertical:absolute;mso-position-vertical-relative:text;v-text-anchor:top" o:gfxdata="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" stroked="f">
+              <v:shape id="Text Box 1" o:spid="_x0000_s1026" type="#_x0000_t202" style="position:absolute;left:0;text-align:left;margin-left:81.15pt;margin-top:644.95pt;width:288.9pt;height:.05pt;z-index:251723776;visibility:visible;mso-wrap-style:square;mso-wrap-distance-left:9pt;mso-wrap-distance-top:0;mso-wrap-distance-right:9pt;mso-wrap-distance-bottom:0;mso-position-horizontal:absolute;mso-position-horizontal-relative:text;mso-position-vertical:absolute;mso-position-vertical-relative:text;v-text-anchor:top" o:gfxdata="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" stroked="f">
                 <v:textbox style="mso-fit-shape-to-text:t" inset="0,0,0,0">
                   <w:txbxContent>
                     <w:p>
@@ -1244,7 +1244,7 @@
         <mc:AlternateContent>
           <mc:Choice Requires="wps">
             <w:drawing>
-              <wp:anchor distT="0" distB="0" distL="114300" distR="114300" simplePos="0" relativeHeight="251725824" behindDoc="0" locked="0" layoutInCell="1" allowOverlap="1" wp14:anchorId="6D15C2F7" wp14:editId="0859E956">
+              <wp:anchor distT="0" distB="0" distL="114300" distR="114300" simplePos="0" relativeHeight="251725824" behindDoc="0" locked="0" layoutInCell="1" allowOverlap="1" wp14:anchorId="6D15C2F7" wp14:editId="68526375">
                 <wp:simplePos x="0" y="0"/>
                 <wp:positionH relativeFrom="margin">
                   <wp:align>center</wp:align>
@@ -1350,7 +1350,7 @@
           </mc:Choice>
           <mc:Fallback>
             <w:pict>
-              <v:shape w14:anchorId="6D15C2F7" id="_x0000_s1027" type="#_x0000_t202" style="position:absolute;left:0;text-align:left;margin-left:0;margin-top:396.8pt;width:451.25pt;height:.05pt;z-index:251725824;visibility:visible;mso-wrap-style:square;mso-wrap-distance-left:9pt;mso-wrap-distance-top:0;mso-wrap-distance-right:9pt;mso-wrap-distance-bottom:0;mso-position-horizontal:center;mso-position-horizontal-relative:margin;mso-position-vertical:absolute;mso-position-vertical-relative:text;v-text-anchor:top" o:gfxdata="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" stroked="f">
+              <v:shape w14:anchorId="6D15C2F7" id="_x0000_s1027" type="#_x0000_t202" style="position:absolute;left:0;text-align:left;margin-left:0;margin-top:396.8pt;width:451.25pt;height:.05pt;z-index:251725824;visibility:visible;mso-wrap-style:square;mso-wrap-distance-left:9pt;mso-wrap-distance-top:0;mso-wrap-distance-right:9pt;mso-wrap-distance-bottom:0;mso-position-horizontal:center;mso-position-horizontal-relative:margin;mso-position-vertical:absolute;mso-position-vertical-relative:text;v-text-anchor:top" o:gfxdata="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" stroked="f">
                 <v:textbox style="mso-fit-shape-to-text:t" inset="0,0,0,0">
                   <w:txbxContent>
                     <w:p>
@@ -1507,6 +1507,9 @@
         <w:keepNext/>
       </w:pPr>
       <w:r>
+        <w:rPr>
+          <w:noProof/>
+        </w:rPr>
         <w:drawing>
           <wp:inline distT="0" distB="0" distL="0" distR="0" wp14:anchorId="7D214A35" wp14:editId="2587DB33">
             <wp:extent cx="5731510" cy="2849880"/>
@@ -1602,6 +1605,475 @@
     </w:p>
     <w:p>
       <w:pPr>
+        <w:pStyle w:val="Heading2"/>
+      </w:pPr>
+      <w:r>
+        <w:rPr>
+          <w:noProof/>
+        </w:rPr>
+        <w:lastRenderedPageBreak/>
+        <w:drawing>
+          <wp:anchor distT="0" distB="0" distL="114300" distR="114300" simplePos="0" relativeHeight="251747328" behindDoc="0" locked="0" layoutInCell="1" allowOverlap="1" wp14:anchorId="70D1BBE0" wp14:editId="12D4863E">
+            <wp:simplePos x="0" y="0"/>
+            <wp:positionH relativeFrom="margin">
+              <wp:posOffset>342900</wp:posOffset>
+            </wp:positionH>
+            <wp:positionV relativeFrom="paragraph">
+              <wp:posOffset>2358390</wp:posOffset>
+            </wp:positionV>
+            <wp:extent cx="5010150" cy="5692140"/>
+            <wp:effectExtent l="0" t="0" r="0" b="0"/>
+            <wp:wrapTopAndBottom/>
+            <wp:docPr id="1828441017" name="Picture 25"/>
+            <wp:cNvGraphicFramePr>
+              <a:graphicFrameLocks xmlns:a="http://schemas.openxmlformats.org/drawingml/2006/main" noChangeAspect="1"/>
+            </wp:cNvGraphicFramePr>
+            <a:graphic xmlns:a="http://schemas.openxmlformats.org/drawingml/2006/main">
+              <a:graphicData uri="http://schemas.openxmlformats.org/drawingml/2006/picture">
+                <pic:pic xmlns:pic="http://schemas.openxmlformats.org/drawingml/2006/picture">
+                  <pic:nvPicPr>
+                    <pic:cNvPr id="1828441017" name="Picture 25"/>
+                    <pic:cNvPicPr/>
+                  </pic:nvPicPr>
+                  <pic:blipFill rotWithShape="1">
+                    <a:blip r:embed="rId13">
+                      <a:extLst>
+                        <a:ext uri="{28A0092B-C50C-407E-A947-70E740481C1C}">
+                          <a14:useLocalDpi xmlns:a14="http://schemas.microsoft.com/office/drawing/2010/main" val="0"/>
+                        </a:ext>
+                      </a:extLst>
+                    </a:blip>
+                    <a:srcRect l="-340" t="410" r="340" b="-1268"/>
+                    <a:stretch>
+                      <a:fillRect/>
+                    </a:stretch>
+                  </pic:blipFill>
+                  <pic:spPr bwMode="auto">
+                    <a:xfrm>
+                      <a:off x="0" y="0"/>
+                      <a:ext cx="5010150" cy="5692140"/>
+                    </a:xfrm>
+                    <a:prstGeom prst="rect">
+                      <a:avLst/>
+                    </a:prstGeom>
+                    <a:ln>
+                      <a:noFill/>
+                    </a:ln>
+                    <a:extLst>
+                      <a:ext uri="{53640926-AAD7-44D8-BBD7-CCE9431645EC}">
+                        <a14:shadowObscured xmlns:a14="http://schemas.microsoft.com/office/drawing/2010/main"/>
+                      </a:ext>
+                    </a:extLst>
+                  </pic:spPr>
+                </pic:pic>
+              </a:graphicData>
+            </a:graphic>
+            <wp14:sizeRelH relativeFrom="page">
+              <wp14:pctWidth>0</wp14:pctWidth>
+            </wp14:sizeRelH>
+            <wp14:sizeRelV relativeFrom="page">
+              <wp14:pctHeight>0</wp14:pctHeight>
+            </wp14:sizeRelV>
+          </wp:anchor>
+        </w:drawing>
+      </w:r>
+      <w:r>
+        <w:rPr>
+          <w:noProof/>
+        </w:rPr>
+        <w:drawing>
+          <wp:anchor distT="0" distB="0" distL="114300" distR="114300" simplePos="0" relativeHeight="251744256" behindDoc="0" locked="0" layoutInCell="1" allowOverlap="1" wp14:anchorId="5AB6A515" wp14:editId="716F427F">
+            <wp:simplePos x="0" y="0"/>
+            <wp:positionH relativeFrom="margin">
+              <wp:posOffset>-497840</wp:posOffset>
+            </wp:positionH>
+            <wp:positionV relativeFrom="paragraph">
+              <wp:posOffset>390525</wp:posOffset>
+            </wp:positionV>
+            <wp:extent cx="6735356" cy="1809750"/>
+            <wp:effectExtent l="0" t="0" r="8890" b="0"/>
+            <wp:wrapTopAndBottom/>
+            <wp:docPr id="1276330230" name="Picture 25"/>
+            <wp:cNvGraphicFramePr>
+              <a:graphicFrameLocks xmlns:a="http://schemas.openxmlformats.org/drawingml/2006/main" noChangeAspect="1"/>
+            </wp:cNvGraphicFramePr>
+            <a:graphic xmlns:a="http://schemas.openxmlformats.org/drawingml/2006/main">
+              <a:graphicData uri="http://schemas.openxmlformats.org/drawingml/2006/picture">
+                <pic:pic xmlns:pic="http://schemas.openxmlformats.org/drawingml/2006/picture">
+                  <pic:nvPicPr>
+                    <pic:cNvPr id="1276330230" name="Picture 25"/>
+                    <pic:cNvPicPr/>
+                  </pic:nvPicPr>
+                  <pic:blipFill rotWithShape="1">
+                    <a:blip r:embed="rId14">
+                      <a:extLst>
+                        <a:ext uri="{28A0092B-C50C-407E-A947-70E740481C1C}">
+                          <a14:useLocalDpi xmlns:a14="http://schemas.microsoft.com/office/drawing/2010/main" val="0"/>
+                        </a:ext>
+                      </a:extLst>
+                    </a:blip>
+                    <a:srcRect l="2842" r="2330"/>
+                    <a:stretch>
+                      <a:fillRect/>
+                    </a:stretch>
+                  </pic:blipFill>
+                  <pic:spPr bwMode="auto">
+                    <a:xfrm>
+                      <a:off x="0" y="0"/>
+                      <a:ext cx="6735356" cy="1809750"/>
+                    </a:xfrm>
+                    <a:prstGeom prst="rect">
+                      <a:avLst/>
+                    </a:prstGeom>
+                    <a:ln>
+                      <a:noFill/>
+                    </a:ln>
+                    <a:extLst>
+                      <a:ext uri="{53640926-AAD7-44D8-BBD7-CCE9431645EC}">
+                        <a14:shadowObscured xmlns:a14="http://schemas.microsoft.com/office/drawing/2010/main"/>
+                      </a:ext>
+                    </a:extLst>
+                  </pic:spPr>
+                </pic:pic>
+              </a:graphicData>
+            </a:graphic>
+            <wp14:sizeRelH relativeFrom="page">
+              <wp14:pctWidth>0</wp14:pctWidth>
+            </wp14:sizeRelH>
+            <wp14:sizeRelV relativeFrom="page">
+              <wp14:pctHeight>0</wp14:pctHeight>
+            </wp14:sizeRelV>
+          </wp:anchor>
+        </w:drawing>
+      </w:r>
+      <w:r>
+        <w:t>Data Flow Diagram</w:t>
+      </w:r>
+      <w:r>
+        <w:t xml:space="preserve"> </w:t>
+      </w:r>
+    </w:p>
+    <w:p>
+      <w:pPr>
+        <w:pStyle w:val="contentnormal"/>
+        <w:rPr>
+          <w:rFonts w:eastAsiaTheme="majorEastAsia"/>
+          <w:sz w:val="32"/>
+          <w:szCs w:val="28"/>
+        </w:rPr>
+      </w:pPr>
+      <w:r>
+        <w:rPr>
+          <w:noProof/>
+        </w:rPr>
+        <mc:AlternateContent>
+          <mc:Choice Requires="wps">
+            <w:drawing>
+              <wp:anchor distT="0" distB="0" distL="114300" distR="114300" simplePos="0" relativeHeight="251748352" behindDoc="0" locked="0" layoutInCell="1" allowOverlap="1" wp14:anchorId="55E9B887" wp14:editId="3ED7C7F6">
+                <wp:simplePos x="0" y="0"/>
+                <wp:positionH relativeFrom="column">
+                  <wp:posOffset>1001395</wp:posOffset>
+                </wp:positionH>
+                <wp:positionV relativeFrom="paragraph">
+                  <wp:posOffset>7778750</wp:posOffset>
+                </wp:positionV>
+                <wp:extent cx="3669030" cy="635"/>
+                <wp:effectExtent l="0" t="0" r="7620" b="9525"/>
+                <wp:wrapSquare wrapText="bothSides"/>
+                <wp:docPr id="207316059" name="Text Box 1"/>
+                <wp:cNvGraphicFramePr/>
+                <a:graphic xmlns:a="http://schemas.openxmlformats.org/drawingml/2006/main">
+                  <a:graphicData uri="http://schemas.microsoft.com/office/word/2010/wordprocessingShape">
+                    <wps:wsp>
+                      <wps:cNvSpPr txBox="1"/>
+                      <wps:spPr>
+                        <a:xfrm>
+                          <a:off x="0" y="0"/>
+                          <a:ext cx="3669030" cy="635"/>
+                        </a:xfrm>
+                        <a:prstGeom prst="rect">
+                          <a:avLst/>
+                        </a:prstGeom>
+                        <a:solidFill>
+                          <a:prstClr val="white"/>
+                        </a:solidFill>
+                        <a:ln>
+                          <a:noFill/>
+                        </a:ln>
+                      </wps:spPr>
+                      <wps:txbx>
+                        <w:txbxContent>
+                          <w:p>
+                            <w:pPr>
+                              <w:pStyle w:val="Caption"/>
+                              <w:rPr>
+                                <w:b/>
+                                <w:noProof/>
+                                <w:sz w:val="28"/>
+                                <w:szCs w:val="28"/>
+                              </w:rPr>
+                            </w:pPr>
+                            <w:r>
+                              <w:t xml:space="preserve">Figure </w:t>
+                            </w:r>
+                            <w:r>
+                              <w:fldChar w:fldCharType="begin"/>
+                            </w:r>
+                            <w:r>
+                              <w:instrText xml:space="preserve"> STYLEREF 1 \s </w:instrText>
+                            </w:r>
+                            <w:r>
+                              <w:fldChar w:fldCharType="separate"/>
+                            </w:r>
+                            <w:r>
+                              <w:rPr>
+                                <w:noProof/>
+                              </w:rPr>
+                              <w:t>1</w:t>
+                            </w:r>
+                            <w:r>
+                              <w:fldChar w:fldCharType="end"/>
+                            </w:r>
+                            <w:r>
+                              <w:t>.</w:t>
+                            </w:r>
+                            <w:r>
+                              <w:t>5</w:t>
+                            </w:r>
+                            <w:r>
+                              <w:t xml:space="preserve"> Activity Diagram</w:t>
+                            </w:r>
+                          </w:p>
+                        </w:txbxContent>
+                      </wps:txbx>
+                      <wps:bodyPr rot="0" spcFirstLastPara="0" vertOverflow="overflow" horzOverflow="overflow" vert="horz" wrap="square" lIns="0" tIns="0" rIns="0" bIns="0" numCol="1" spcCol="0" rtlCol="0" fromWordArt="0" anchor="t" anchorCtr="0" forceAA="0" compatLnSpc="1">
+                        <a:prstTxWarp prst="textNoShape">
+                          <a:avLst/>
+                        </a:prstTxWarp>
+                        <a:spAutoFit/>
+                      </wps:bodyPr>
+                    </wps:wsp>
+                  </a:graphicData>
+                </a:graphic>
+              </wp:anchor>
+            </w:drawing>
+          </mc:Choice>
+          <mc:Fallback>
+            <w:pict>
+              <v:shape w14:anchorId="55E9B887" id="_x0000_s1028" type="#_x0000_t202" style="position:absolute;left:0;text-align:left;margin-left:78.85pt;margin-top:612.5pt;width:288.9pt;height:.05pt;z-index:251748352;visibility:visible;mso-wrap-style:square;mso-wrap-distance-left:9pt;mso-wrap-distance-top:0;mso-wrap-distance-right:9pt;mso-wrap-distance-bottom:0;mso-position-horizontal:absolute;mso-position-horizontal-relative:text;mso-position-vertical:absolute;mso-position-vertical-relative:text;v-text-anchor:top" o:gfxdata="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" stroked="f">
+                <v:textbox style="mso-fit-shape-to-text:t" inset="0,0,0,0">
+                  <w:txbxContent>
+                    <w:p>
+                      <w:pPr>
+                        <w:pStyle w:val="Caption"/>
+                        <w:rPr>
+                          <w:b/>
+                          <w:noProof/>
+                          <w:sz w:val="28"/>
+                          <w:szCs w:val="28"/>
+                        </w:rPr>
+                      </w:pPr>
+                      <w:r>
+                        <w:t xml:space="preserve">Figure </w:t>
+                      </w:r>
+                      <w:r>
+                        <w:fldChar w:fldCharType="begin"/>
+                      </w:r>
+                      <w:r>
+                        <w:instrText xml:space="preserve"> STYLEREF 1 \s </w:instrText>
+                      </w:r>
+                      <w:r>
+                        <w:fldChar w:fldCharType="separate"/>
+                      </w:r>
+                      <w:r>
+                        <w:rPr>
+                          <w:noProof/>
+                        </w:rPr>
+                        <w:t>1</w:t>
+                      </w:r>
+                      <w:r>
+                        <w:fldChar w:fldCharType="end"/>
+                      </w:r>
+                      <w:r>
+                        <w:t>.</w:t>
+                      </w:r>
+                      <w:r>
+                        <w:t>5</w:t>
+                      </w:r>
+                      <w:r>
+                        <w:t xml:space="preserve"> Activity Diagram</w:t>
+                      </w:r>
+                    </w:p>
+                  </w:txbxContent>
+                </v:textbox>
+                <w10:wrap type="square"/>
+              </v:shape>
+            </w:pict>
+          </mc:Fallback>
+        </mc:AlternateContent>
+      </w:r>
+      <w:r>
+        <w:rPr>
+          <w:noProof/>
+        </w:rPr>
+        <mc:AlternateContent>
+          <mc:Choice Requires="wps">
+            <w:drawing>
+              <wp:anchor distT="0" distB="0" distL="114300" distR="114300" simplePos="0" relativeHeight="251745280" behindDoc="0" locked="0" layoutInCell="1" allowOverlap="1" wp14:anchorId="6F49156F" wp14:editId="4724DE40">
+                <wp:simplePos x="0" y="0"/>
+                <wp:positionH relativeFrom="column">
+                  <wp:posOffset>1019175</wp:posOffset>
+                </wp:positionH>
+                <wp:positionV relativeFrom="paragraph">
+                  <wp:posOffset>1544320</wp:posOffset>
+                </wp:positionV>
+                <wp:extent cx="3669030" cy="635"/>
+                <wp:effectExtent l="0" t="0" r="7620" b="9525"/>
+                <wp:wrapSquare wrapText="bothSides"/>
+                <wp:docPr id="1415612146" name="Text Box 1"/>
+                <wp:cNvGraphicFramePr/>
+                <a:graphic xmlns:a="http://schemas.openxmlformats.org/drawingml/2006/main">
+                  <a:graphicData uri="http://schemas.microsoft.com/office/word/2010/wordprocessingShape">
+                    <wps:wsp>
+                      <wps:cNvSpPr txBox="1"/>
+                      <wps:spPr>
+                        <a:xfrm>
+                          <a:off x="0" y="0"/>
+                          <a:ext cx="3669030" cy="635"/>
+                        </a:xfrm>
+                        <a:prstGeom prst="rect">
+                          <a:avLst/>
+                        </a:prstGeom>
+                        <a:solidFill>
+                          <a:prstClr val="white"/>
+                        </a:solidFill>
+                        <a:ln>
+                          <a:noFill/>
+                        </a:ln>
+                      </wps:spPr>
+                      <wps:txbx>
+                        <w:txbxContent>
+                          <w:p>
+                            <w:pPr>
+                              <w:pStyle w:val="Caption"/>
+                              <w:rPr>
+                                <w:b/>
+                                <w:noProof/>
+                                <w:sz w:val="28"/>
+                                <w:szCs w:val="28"/>
+                              </w:rPr>
+                            </w:pPr>
+                            <w:r>
+                              <w:t xml:space="preserve">Figure </w:t>
+                            </w:r>
+                            <w:r>
+                              <w:fldChar w:fldCharType="begin"/>
+                            </w:r>
+                            <w:r>
+                              <w:instrText xml:space="preserve"> STYLEREF 1 \s </w:instrText>
+                            </w:r>
+                            <w:r>
+                              <w:fldChar w:fldCharType="separate"/>
+                            </w:r>
+                            <w:r>
+                              <w:rPr>
+                                <w:noProof/>
+                              </w:rPr>
+                              <w:t>1</w:t>
+                            </w:r>
+                            <w:r>
+                              <w:fldChar w:fldCharType="end"/>
+                            </w:r>
+                            <w:r>
+                              <w:t>.</w:t>
+                            </w:r>
+                            <w:r>
+                              <w:t>4</w:t>
+                            </w:r>
+                            <w:r>
+                              <w:t xml:space="preserve"> Activity Diagram</w:t>
+                            </w:r>
+                          </w:p>
+                        </w:txbxContent>
+                      </wps:txbx>
+                      <wps:bodyPr rot="0" spcFirstLastPara="0" vertOverflow="overflow" horzOverflow="overflow" vert="horz" wrap="square" lIns="0" tIns="0" rIns="0" bIns="0" numCol="1" spcCol="0" rtlCol="0" fromWordArt="0" anchor="t" anchorCtr="0" forceAA="0" compatLnSpc="1">
+                        <a:prstTxWarp prst="textNoShape">
+                          <a:avLst/>
+                        </a:prstTxWarp>
+                        <a:spAutoFit/>
+                      </wps:bodyPr>
+                    </wps:wsp>
+                  </a:graphicData>
+                </a:graphic>
+              </wp:anchor>
+            </w:drawing>
+          </mc:Choice>
+          <mc:Fallback>
+            <w:pict>
+              <v:shape w14:anchorId="6F49156F" id="_x0000_s1029" type="#_x0000_t202" style="position:absolute;left:0;text-align:left;margin-left:80.25pt;margin-top:121.6pt;width:288.9pt;height:.05pt;z-index:251745280;visibility:visible;mso-wrap-style:square;mso-wrap-distance-left:9pt;mso-wrap-distance-top:0;mso-wrap-distance-right:9pt;mso-wrap-distance-bottom:0;mso-position-horizontal:absolute;mso-position-horizontal-relative:text;mso-position-vertical:absolute;mso-position-vertical-relative:text;v-text-anchor:top" o:gfxdata="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" stroked="f">
+                <v:textbox style="mso-fit-shape-to-text:t" inset="0,0,0,0">
+                  <w:txbxContent>
+                    <w:p>
+                      <w:pPr>
+                        <w:pStyle w:val="Caption"/>
+                        <w:rPr>
+                          <w:b/>
+                          <w:noProof/>
+                          <w:sz w:val="28"/>
+                          <w:szCs w:val="28"/>
+                        </w:rPr>
+                      </w:pPr>
+                      <w:r>
+                        <w:t xml:space="preserve">Figure </w:t>
+                      </w:r>
+                      <w:r>
+                        <w:fldChar w:fldCharType="begin"/>
+                      </w:r>
+                      <w:r>
+                        <w:instrText xml:space="preserve"> STYLEREF 1 \s </w:instrText>
+                      </w:r>
+                      <w:r>
+                        <w:fldChar w:fldCharType="separate"/>
+                      </w:r>
+                      <w:r>
+                        <w:rPr>
+                          <w:noProof/>
+                        </w:rPr>
+                        <w:t>1</w:t>
+                      </w:r>
+                      <w:r>
+                        <w:fldChar w:fldCharType="end"/>
+                      </w:r>
+                      <w:r>
+                        <w:t>.</w:t>
+                      </w:r>
+                      <w:r>
+                        <w:t>4</w:t>
+                      </w:r>
+                      <w:r>
+                        <w:t xml:space="preserve"> Activity Diagram</w:t>
+                      </w:r>
+                    </w:p>
+                  </w:txbxContent>
+                </v:textbox>
+                <w10:wrap type="square"/>
+              </v:shape>
+            </w:pict>
+          </mc:Fallback>
+        </mc:AlternateContent>
+      </w:r>
+      <w:r>
+        <w:rPr>
+          <w:noProof/>
+        </w:rPr>
+        <w:tab/>
+      </w:r>
+      <w:r>
+        <w:br w:type="page"/>
+      </w:r>
+    </w:p>
+    <w:p>
+      <w:pPr>
         <w:pStyle w:val="Heading1"/>
       </w:pPr>
       <w:r>
@@ -1967,7 +2439,7 @@
         </w:rPr>
         <w:t xml:space="preserve"> </w:t>
       </w:r>
-      <w:hyperlink r:id="rId13" w:history="1">
+      <w:hyperlink r:id="rId15" w:history="1">
         <w:r>
           <w:rPr>
             <w:rStyle w:val="Hyperlink"/>
@@ -2045,7 +2517,7 @@
         </w:rPr>
         <w:t xml:space="preserve">Link: </w:t>
       </w:r>
-      <w:hyperlink r:id="rId14" w:history="1">
+      <w:hyperlink r:id="rId16" w:history="1">
         <w:r>
           <w:rPr>
             <w:rStyle w:val="Hyperlink"/>
@@ -2113,7 +2585,7 @@
         </w:rPr>
         <w:t xml:space="preserve"> </w:t>
       </w:r>
-      <w:hyperlink r:id="rId15" w:history="1">
+      <w:hyperlink r:id="rId17" w:history="1">
         <w:r>
           <w:rPr>
             <w:rStyle w:val="Hyperlink"/>
@@ -2183,7 +2655,7 @@
         </w:rPr>
         <w:t xml:space="preserve"> </w:t>
       </w:r>
-      <w:hyperlink r:id="rId16" w:history="1">
+      <w:hyperlink r:id="rId18" w:history="1">
         <w:r>
           <w:rPr>
             <w:rStyle w:val="Hyperlink"/>
@@ -2229,7 +2701,7 @@
         </w:rPr>
         <w:t xml:space="preserve">Link: </w:t>
       </w:r>
-      <w:hyperlink r:id="rId17" w:history="1">
+      <w:hyperlink r:id="rId19" w:history="1">
         <w:r>
           <w:rPr>
             <w:rStyle w:val="Hyperlink"/>
@@ -2302,7 +2774,7 @@
         </w:rPr>
         <w:t xml:space="preserve">Link: </w:t>
       </w:r>
-      <w:hyperlink r:id="rId18" w:history="1">
+      <w:hyperlink r:id="rId20" w:history="1">
         <w:r>
           <w:rPr>
             <w:rStyle w:val="Hyperlink"/>
@@ -2350,7 +2822,7 @@
         </w:rPr>
         <w:t xml:space="preserve">Link: </w:t>
       </w:r>
-      <w:hyperlink r:id="rId19" w:history="1">
+      <w:hyperlink r:id="rId21" w:history="1">
         <w:r>
           <w:rPr>
             <w:rStyle w:val="Hyperlink"/>
@@ -2398,7 +2870,7 @@
         </w:rPr>
         <w:t xml:space="preserve"> </w:t>
       </w:r>
-      <w:hyperlink r:id="rId20" w:history="1">
+      <w:hyperlink r:id="rId22" w:history="1">
         <w:r>
           <w:rPr>
             <w:rStyle w:val="Hyperlink"/>
@@ -2448,7 +2920,7 @@
         </w:rPr>
         <w:t xml:space="preserve"> </w:t>
       </w:r>
-      <w:hyperlink r:id="rId21" w:history="1">
+      <w:hyperlink r:id="rId23" w:history="1">
         <w:r>
           <w:rPr>
             <w:rStyle w:val="Hyperlink"/>
@@ -2497,7 +2969,7 @@
         </w:rPr>
         <w:t xml:space="preserve">Link: </w:t>
       </w:r>
-      <w:hyperlink r:id="rId22" w:history="1">
+      <w:hyperlink r:id="rId24" w:history="1">
         <w:r>
           <w:rPr>
             <w:rStyle w:val="Hyperlink"/>
@@ -4034,7 +4506,7 @@
       <w:pPr>
         <w:pStyle w:val="contentnormal"/>
       </w:pPr>
-      <w:hyperlink r:id="rId23" w:history="1">
+      <w:hyperlink r:id="rId25" w:history="1">
         <w:r>
           <w:rPr>
             <w:rStyle w:val="Hyperlink"/>
@@ -4060,7 +4532,7 @@
       <w:pPr>
         <w:pStyle w:val="contentnormal"/>
       </w:pPr>
-      <w:hyperlink r:id="rId24" w:history="1">
+      <w:hyperlink r:id="rId26" w:history="1">
         <w:r>
           <w:rPr>
             <w:rStyle w:val="Hyperlink"/>
@@ -4086,7 +4558,7 @@
       <w:pPr>
         <w:pStyle w:val="contentnormal"/>
       </w:pPr>
-      <w:hyperlink r:id="rId25" w:history="1">
+      <w:hyperlink r:id="rId27" w:history="1">
         <w:r>
           <w:rPr>
             <w:rStyle w:val="Hyperlink"/>
@@ -4118,7 +4590,7 @@
       <w:pPr>
         <w:pStyle w:val="contentnormal"/>
       </w:pPr>
-      <w:hyperlink r:id="rId26" w:history="1">
+      <w:hyperlink r:id="rId28" w:history="1">
         <w:r>
           <w:rPr>
             <w:rStyle w:val="Hyperlink"/>
@@ -5663,7 +6135,7 @@
           </mc:Choice>
           <mc:Fallback>
             <w:pict>
-              <v:shape w14:anchorId="4F5518AC" id="_x0000_s1028" type="#_x0000_t202" style="position:absolute;left:0;text-align:left;margin-left:141.05pt;margin-top:138.8pt;width:169.2pt;height:.05pt;z-index:251727872;visibility:visible;mso-wrap-style:square;mso-wrap-distance-left:9pt;mso-wrap-distance-top:0;mso-wrap-distance-right:9pt;mso-wrap-distance-bottom:0;mso-position-horizontal:absolute;mso-position-horizontal-relative:text;mso-position-vertical:absolute;mso-position-vertical-relative:text;v-text-anchor:top" o:gfxdata="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" stroked="f">
+              <v:shape w14:anchorId="4F5518AC" id="_x0000_s1030" type="#_x0000_t202" style="position:absolute;left:0;text-align:left;margin-left:141.05pt;margin-top:138.8pt;width:169.2pt;height:.05pt;z-index:251727872;visibility:visible;mso-wrap-style:square;mso-wrap-distance-left:9pt;mso-wrap-distance-top:0;mso-wrap-distance-right:9pt;mso-wrap-distance-bottom:0;mso-position-horizontal:absolute;mso-position-horizontal-relative:text;mso-position-vertical:absolute;mso-position-vertical-relative:text;v-text-anchor:top" o:gfxdata="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" stroked="f">
                 <v:textbox style="mso-fit-shape-to-text:t" inset="0,0,0,0">
                   <w:txbxContent>
                     <w:p>
@@ -5758,7 +6230,7 @@
                     </pic:cNvPicPr>
                   </pic:nvPicPr>
                   <pic:blipFill rotWithShape="1">
-                    <a:blip r:embed="rId27" cstate="print">
+                    <a:blip r:embed="rId29" cstate="print">
                       <a:extLst>
                         <a:ext uri="{28A0092B-C50C-407E-A947-70E740481C1C}">
                           <a14:useLocalDpi xmlns:a14="http://schemas.microsoft.com/office/drawing/2010/main" val="0"/>
@@ -6039,7 +6511,7 @@
           </mc:Choice>
           <mc:Fallback>
             <w:pict>
-              <v:shape w14:anchorId="3F7A67F9" id="_x0000_s1029" type="#_x0000_t202" style="position:absolute;left:0;text-align:left;margin-left:135.5pt;margin-top:151.9pt;width:180.25pt;height:.05pt;z-index:251729920;visibility:visible;mso-wrap-style:square;mso-wrap-distance-left:9pt;mso-wrap-distance-top:0;mso-wrap-distance-right:9pt;mso-wrap-distance-bottom:0;mso-position-horizontal:absolute;mso-position-horizontal-relative:text;mso-position-vertical:absolute;mso-position-vertical-relative:text;v-text-anchor:top" o:gfxdata="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" stroked="f">
+              <v:shape w14:anchorId="3F7A67F9" id="_x0000_s1031" type="#_x0000_t202" style="position:absolute;left:0;text-align:left;margin-left:135.5pt;margin-top:151.9pt;width:180.25pt;height:.05pt;z-index:251729920;visibility:visible;mso-wrap-style:square;mso-wrap-distance-left:9pt;mso-wrap-distance-top:0;mso-wrap-distance-right:9pt;mso-wrap-distance-bottom:0;mso-position-horizontal:absolute;mso-position-horizontal-relative:text;mso-position-vertical:absolute;mso-position-vertical-relative:text;v-text-anchor:top" o:gfxdata="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" stroked="f">
                 <v:textbox style="mso-fit-shape-to-text:t" inset="0,0,0,0">
                   <w:txbxContent>
                     <w:p>
@@ -6132,7 +6604,7 @@
                     <pic:cNvPicPr/>
                   </pic:nvPicPr>
                   <pic:blipFill rotWithShape="1">
-                    <a:blip r:embed="rId28" cstate="print">
+                    <a:blip r:embed="rId30" cstate="print">
                       <a:extLst>
                         <a:ext uri="{28A0092B-C50C-407E-A947-70E740481C1C}">
                           <a14:useLocalDpi xmlns:a14="http://schemas.microsoft.com/office/drawing/2010/main" val="0"/>
@@ -6355,7 +6827,7 @@
           </mc:Choice>
           <mc:Fallback>
             <w:pict>
-              <v:shape w14:anchorId="4FE8A49D" id="_x0000_s1030" type="#_x0000_t202" style="position:absolute;left:0;text-align:left;margin-left:0;margin-top:189.3pt;width:451.3pt;height:.05pt;z-index:251703296;visibility:visible;mso-wrap-style:square;mso-wrap-distance-left:9pt;mso-wrap-distance-top:0;mso-wrap-distance-right:9pt;mso-wrap-distance-bottom:0;mso-position-horizontal:absolute;mso-position-horizontal-relative:margin;mso-position-vertical:absolute;mso-position-vertical-relative:text;v-text-anchor:top" o:gfxdata="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" stroked="f">
+              <v:shape w14:anchorId="4FE8A49D" id="_x0000_s1032" type="#_x0000_t202" style="position:absolute;left:0;text-align:left;margin-left:0;margin-top:189.3pt;width:451.3pt;height:.05pt;z-index:251703296;visibility:visible;mso-wrap-style:square;mso-wrap-distance-left:9pt;mso-wrap-distance-top:0;mso-wrap-distance-right:9pt;mso-wrap-distance-bottom:0;mso-position-horizontal:absolute;mso-position-horizontal-relative:margin;mso-position-vertical:absolute;mso-position-vertical-relative:text;v-text-anchor:top" o:gfxdata="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" stroked="f">
                 <v:textbox style="mso-fit-shape-to-text:t" inset="0,0,0,0">
                   <w:txbxContent>
                     <w:p>
@@ -6449,7 +6921,7 @@
                     <pic:cNvPicPr/>
                   </pic:nvPicPr>
                   <pic:blipFill>
-                    <a:blip r:embed="rId29" cstate="print">
+                    <a:blip r:embed="rId31" cstate="print">
                       <a:extLst>
                         <a:ext uri="{28A0092B-C50C-407E-A947-70E740481C1C}">
                           <a14:useLocalDpi xmlns:a14="http://schemas.microsoft.com/office/drawing/2010/main" val="0"/>
@@ -6629,7 +7101,7 @@
           </mc:Choice>
           <mc:Fallback>
             <w:pict>
-              <v:shape w14:anchorId="2B5BFAF6" id="_x0000_s1031" type="#_x0000_t202" style="position:absolute;left:0;text-align:left;margin-left:251pt;margin-top:165.1pt;width:198.4pt;height:.05pt;z-index:251742208;visibility:visible;mso-wrap-style:square;mso-height-percent:0;mso-wrap-distance-left:9pt;mso-wrap-distance-top:0;mso-wrap-distance-right:9pt;mso-wrap-distance-bottom:0;mso-position-horizontal:absolute;mso-position-horizontal-relative:text;mso-position-vertical:absolute;mso-position-vertical-relative:text;mso-height-percent:0;mso-height-relative:margin;v-text-anchor:top" o:gfxdata="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" stroked="f">
+              <v:shape w14:anchorId="2B5BFAF6" id="_x0000_s1033" type="#_x0000_t202" style="position:absolute;left:0;text-align:left;margin-left:251pt;margin-top:165.1pt;width:198.4pt;height:.05pt;z-index:251742208;visibility:visible;mso-wrap-style:square;mso-height-percent:0;mso-wrap-distance-left:9pt;mso-wrap-distance-top:0;mso-wrap-distance-right:9pt;mso-wrap-distance-bottom:0;mso-position-horizontal:absolute;mso-position-horizontal-relative:text;mso-position-vertical:absolute;mso-position-vertical-relative:text;mso-height-percent:0;mso-height-relative:margin;v-text-anchor:top" o:gfxdata="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" stroked="f">
                 <v:textbox style="mso-fit-shape-to-text:t" inset="0,0,0,0">
                   <w:txbxContent>
                     <w:p>
@@ -6771,7 +7243,7 @@
           </mc:Choice>
           <mc:Fallback>
             <w:pict>
-              <v:shape w14:anchorId="07878B84" id="_x0000_s1032" type="#_x0000_t202" style="position:absolute;left:0;text-align:left;margin-left:-.1pt;margin-top:165.05pt;width:198.4pt;height:.05pt;z-index:251740160;visibility:visible;mso-wrap-style:square;mso-wrap-distance-left:9pt;mso-wrap-distance-top:0;mso-wrap-distance-right:9pt;mso-wrap-distance-bottom:0;mso-position-horizontal:absolute;mso-position-horizontal-relative:text;mso-position-vertical:absolute;mso-position-vertical-relative:text;v-text-anchor:top" o:gfxdata="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" stroked="f">
+              <v:shape w14:anchorId="07878B84" id="_x0000_s1034" type="#_x0000_t202" style="position:absolute;left:0;text-align:left;margin-left:-.1pt;margin-top:165.05pt;width:198.4pt;height:.05pt;z-index:251740160;visibility:visible;mso-wrap-style:square;mso-wrap-distance-left:9pt;mso-wrap-distance-top:0;mso-wrap-distance-right:9pt;mso-wrap-distance-bottom:0;mso-position-horizontal:absolute;mso-position-horizontal-relative:text;mso-position-vertical:absolute;mso-position-vertical-relative:text;v-text-anchor:top" o:gfxdata="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" stroked="f">
                 <v:textbox style="mso-fit-shape-to-text:t" inset="0,0,0,0">
                   <w:txbxContent>
                     <w:p>
@@ -6851,7 +7323,7 @@
                     <pic:cNvPicPr/>
                   </pic:nvPicPr>
                   <pic:blipFill>
-                    <a:blip r:embed="rId30" cstate="print">
+                    <a:blip r:embed="rId32" cstate="print">
                       <a:extLst>
                         <a:ext uri="{28A0092B-C50C-407E-A947-70E740481C1C}">
                           <a14:useLocalDpi xmlns:a14="http://schemas.microsoft.com/office/drawing/2010/main" val="0"/>
@@ -6911,7 +7383,7 @@
                     <pic:cNvPicPr/>
                   </pic:nvPicPr>
                   <pic:blipFill rotWithShape="1">
-                    <a:blip r:embed="rId31" cstate="print">
+                    <a:blip r:embed="rId33" cstate="print">
                       <a:extLst>
                         <a:ext uri="{28A0092B-C50C-407E-A947-70E740481C1C}">
                           <a14:useLocalDpi xmlns:a14="http://schemas.microsoft.com/office/drawing/2010/main" val="0"/>
@@ -7196,7 +7668,7 @@
           </mc:Choice>
           <mc:Fallback>
             <w:pict>
-              <v:shape w14:anchorId="32F01FB5" id="_x0000_s1033" type="#_x0000_t202" style="position:absolute;left:0;text-align:left;margin-left:126.45pt;margin-top:160.5pt;width:198.4pt;height:.05pt;z-index:251731968;visibility:visible;mso-wrap-style:square;mso-wrap-distance-left:9pt;mso-wrap-distance-top:0;mso-wrap-distance-right:9pt;mso-wrap-distance-bottom:0;mso-position-horizontal:absolute;mso-position-horizontal-relative:text;mso-position-vertical:absolute;mso-position-vertical-relative:text;v-text-anchor:top" o:gfxdata="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" stroked="f">
+              <v:shape w14:anchorId="32F01FB5" id="_x0000_s1035" type="#_x0000_t202" style="position:absolute;left:0;text-align:left;margin-left:126.45pt;margin-top:160.5pt;width:198.4pt;height:.05pt;z-index:251731968;visibility:visible;mso-wrap-style:square;mso-wrap-distance-left:9pt;mso-wrap-distance-top:0;mso-wrap-distance-right:9pt;mso-wrap-distance-bottom:0;mso-position-horizontal:absolute;mso-position-horizontal-relative:text;mso-position-vertical:absolute;mso-position-vertical-relative:text;v-text-anchor:top" o:gfxdata="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" stroked="f">
                 <v:textbox style="mso-fit-shape-to-text:t" inset="0,0,0,0">
                   <w:txbxContent>
                     <w:p>
@@ -7291,7 +7763,7 @@
                     </pic:cNvPicPr>
                   </pic:nvPicPr>
                   <pic:blipFill rotWithShape="1">
-                    <a:blip r:embed="rId32" cstate="print">
+                    <a:blip r:embed="rId34" cstate="print">
                       <a:extLst>
                         <a:ext uri="{28A0092B-C50C-407E-A947-70E740481C1C}">
                           <a14:useLocalDpi xmlns:a14="http://schemas.microsoft.com/office/drawing/2010/main" val="0"/>
@@ -7586,7 +8058,7 @@
           </mc:Choice>
           <mc:Fallback>
             <w:pict>
-              <v:shape w14:anchorId="1367801E" id="_x0000_s1034" type="#_x0000_t202" style="position:absolute;left:0;text-align:left;margin-left:137.95pt;margin-top:159.7pt;width:175.35pt;height:.05pt;z-index:251734016;visibility:visible;mso-wrap-style:square;mso-width-percent:0;mso-wrap-distance-left:9pt;mso-wrap-distance-top:0;mso-wrap-distance-right:9pt;mso-wrap-distance-bottom:0;mso-position-horizontal:absolute;mso-position-horizontal-relative:margin;mso-position-vertical:absolute;mso-position-vertical-relative:text;mso-width-percent:0;mso-width-relative:margin;v-text-anchor:top" o:gfxdata="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" stroked="f">
+              <v:shape w14:anchorId="1367801E" id="_x0000_s1036" type="#_x0000_t202" style="position:absolute;left:0;text-align:left;margin-left:137.95pt;margin-top:159.7pt;width:175.35pt;height:.05pt;z-index:251734016;visibility:visible;mso-wrap-style:square;mso-width-percent:0;mso-wrap-distance-left:9pt;mso-wrap-distance-top:0;mso-wrap-distance-right:9pt;mso-wrap-distance-bottom:0;mso-position-horizontal:absolute;mso-position-horizontal-relative:margin;mso-position-vertical:absolute;mso-position-vertical-relative:text;mso-width-percent:0;mso-width-relative:margin;v-text-anchor:top" o:gfxdata="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" stroked="f">
                 <v:textbox style="mso-fit-shape-to-text:t" inset="0,0,0,0">
                   <w:txbxContent>
                     <w:p>
@@ -7655,7 +8127,7 @@
           <w:noProof/>
         </w:rPr>
         <w:drawing>
-          <wp:anchor distT="0" distB="0" distL="114300" distR="114300" simplePos="0" relativeHeight="251715584" behindDoc="0" locked="0" layoutInCell="1" allowOverlap="1" wp14:anchorId="643AC39F" wp14:editId="51E23939">
+          <wp:anchor distT="0" distB="0" distL="114300" distR="114300" simplePos="0" relativeHeight="251715584" behindDoc="0" locked="0" layoutInCell="1" allowOverlap="1" wp14:anchorId="643AC39F" wp14:editId="696E9F3A">
             <wp:simplePos x="0" y="0"/>
             <wp:positionH relativeFrom="margin">
               <wp:posOffset>2145665</wp:posOffset>
@@ -7680,7 +8152,7 @@
                     </pic:cNvPicPr>
                   </pic:nvPicPr>
                   <pic:blipFill>
-                    <a:blip r:embed="rId33" cstate="print">
+                    <a:blip r:embed="rId35" cstate="print">
                       <a:extLst>
                         <a:ext uri="{28A0092B-C50C-407E-A947-70E740481C1C}">
                           <a14:useLocalDpi xmlns:a14="http://schemas.microsoft.com/office/drawing/2010/main" val="0"/>
@@ -7770,7 +8242,7 @@
       <w:pPr>
         <w:pStyle w:val="contentlist"/>
       </w:pPr>
-      <w:hyperlink r:id="rId34" w:history="1">
+      <w:hyperlink r:id="rId36" w:history="1">
         <w:r>
           <w:rPr>
             <w:rStyle w:val="Hyperlink"/>
@@ -7791,7 +8263,7 @@
       <w:r>
         <w:t xml:space="preserve"> </w:t>
       </w:r>
-      <w:hyperlink r:id="rId35" w:history="1">
+      <w:hyperlink r:id="rId37" w:history="1">
         <w:r>
           <w:rPr>
             <w:rStyle w:val="Hyperlink"/>
@@ -7808,7 +8280,7 @@
       </w:pPr>
     </w:p>
     <w:sectPr>
-      <w:footerReference w:type="default" r:id="rId36"/>
+      <w:footerReference w:type="default" r:id="rId38"/>
       <w:type w:val="continuous"/>
       <w:pgSz w:w="11906" w:h="16838"/>
       <w:pgMar w:top="1440" w:right="1440" w:bottom="1440" w:left="1440" w:header="708" w:footer="708" w:gutter="0"/>
@@ -7827,7 +8299,7 @@
 </file>
 
 <file path=word/endnotes.xml><?xml version="1.0" encoding="utf-8"?>
-<w:endnotes xmlns:wpc="http://schemas.microsoft.com/office/word/2010/wordprocessingCanvas" xmlns:cx="http://schemas.microsoft.com/office/drawing/2014/chartex" xmlns:cx1="http://schemas.microsoft.com/office/drawing/2015/9/8/chartex" xmlns:cx2="http://schemas.microsoft.com/office/drawing/2015/10/21/chartex" xmlns:cx3="http://schemas.microsoft.com/office/drawing/2016/5/9/chartex" xmlns:cx4="http://schemas.microsoft.com/office/drawing/2016/5/10/chartex" xmlns:cx5="http://schemas.microsoft.com/office/drawing/2016/5/11/chartex" xmlns:cx6="http://schemas.microsoft.com/office/drawing/2016/5/12/chartex" xmlns:cx7="http://schemas.microsoft.com/office/drawing/2016/5/13/chartex" xmlns:cx8="http://schemas.microsoft.com/office/drawing/2016/5/14/chartex" xmlns:mc="http://schemas.openxmlformats.org/markup-compatibility/2006" xmlns:aink="http://schemas.microsoft.com/office/drawing/2016/ink" xmlns:am3d="http://schemas.microsoft.com/office/drawing/2017/model3d" xmlns:o="urn:schemas-microsoft-com:office:office" xmlns:oel="http://schemas.microsoft.com/office/2019/extlst" xmlns:r="http://schemas.openxmlformats.org/officeDocument/2006/relationships" xmlns:m="http://schemas.openxmlformats.org/officeDocument/2006/math" xmlns:v="urn:schemas-microsoft-com:vml" xmlns:wp14="http://schemas.microsoft.com/office/word/2010/wordprocessingDrawing" xmlns:wp="http://schemas.openxmlformats.org/drawingml/2006/wordprocessingDrawing" xmlns:w10="urn:schemas-microsoft-com:office:word" xmlns:w="http://schemas.openxmlformats.org/wordprocessingml/2006/main" xmlns:w14="http://schemas.microsoft.com/office/word/2010/wordml" xmlns:w15="http://schemas.microsoft.com/office/word/2012/wordml" xmlns:w16cex="http://schemas.microsoft.com/office/word/2018/wordml/cex" xmlns:w16cid="http://schemas.microsoft.com/office/word/2016/wordml/cid" xmlns:w16="http://schemas.microsoft.com/office/word/2018/wordml" xmlns:w16du="http://schemas.microsoft.com/office/word/2023/wordml/word16du" xmlns:w16sdtdh="http://schemas.microsoft.com/office/word/2020/wordml/sdtdatahash" xmlns:w16sdtfl="http://schemas.microsoft.com/office/word/2024/wordml/sdtformatlock" xmlns:w16se="http://schemas.microsoft.com/office/word/2015/wordml/symex" xmlns:wpg="http://schemas.microsoft.com/office/word/2010/wordprocessingGroup" xmlns:wpi="http://schemas.microsoft.com/office/word/2010/wordprocessingInk" xmlns:wne="http://schemas.microsoft.com/office/word/2006/wordml" xmlns:wps="http://schemas.microsoft.com/office/word/2010/wordprocessingShape" mc:Ignorable="w14 w15 w16se w16cid w16 w16cex w16sdtdh w16sdtfl w16du wp14">
+<w:endnotes xmlns:wpc="http://schemas.microsoft.com/office/word/2010/wordprocessingCanvas" xmlns:cx="http://schemas.microsoft.com/office/drawing/2014/chartex" xmlns:cx1="http://schemas.microsoft.com/office/drawing/2015/9/8/chartex" xmlns:cx2="http://schemas.microsoft.com/office/drawing/2015/10/21/chartex" xmlns:cx3="http://schemas.microsoft.com/office/drawing/2016/5/9/chartex" xmlns:cx4="http://schemas.microsoft.com/office/drawing/2016/5/10/chartex" xmlns:cx5="http://schemas.microsoft.com/office/drawing/2016/5/11/chartex" xmlns:cx6="http://schemas.microsoft.com/office/drawing/2016/5/12/chartex" xmlns:cx7="http://schemas.microsoft.com/office/drawing/2016/5/13/chartex" xmlns:cx8="http://schemas.microsoft.com/office/drawing/2016/5/14/chartex" xmlns:mc="http://schemas.openxmlformats.org/markup-compatibility/2006" xmlns:aink="http://schemas.microsoft.com/office/drawing/2016/ink" xmlns:am3d="http://schemas.microsoft.com/office/drawing/2017/model3d" xmlns:o="urn:schemas-microsoft-com:office:office" xmlns:oel="http://schemas.microsoft.com/office/2019/extlst" xmlns:r="http://schemas.openxmlformats.org/officeDocument/2006/relationships" xmlns:m="http://schemas.openxmlformats.org/officeDocument/2006/math" xmlns:v="urn:schemas-microsoft-com:vml" xmlns:wp14="http://schemas.microsoft.com/office/word/2010/wordprocessingDrawing" xmlns:wp="http://schemas.openxmlformats.org/drawingml/2006/wordprocessingDrawing" xmlns:w10="urn:schemas-microsoft-com:office:word" xmlns:w="http://schemas.openxmlformats.org/wordprocessingml/2006/main" xmlns:w14="http://schemas.microsoft.com/office/word/2010/wordml" xmlns:w15="http://schemas.microsoft.com/office/word/2012/wordml" xmlns:w16cei="http://schemas.microsoft.com/office/word/2026/wordml/cei" xmlns:w16cex="http://schemas.microsoft.com/office/word/2018/wordml/cex" xmlns:w16cid="http://schemas.microsoft.com/office/word/2016/wordml/cid" xmlns:w16="http://schemas.microsoft.com/office/word/2018/wordml" xmlns:w16du="http://schemas.microsoft.com/office/word/2023/wordml/word16du" xmlns:w16sdtdh="http://schemas.microsoft.com/office/word/2020/wordml/sdtdatahash" xmlns:w16sdtfl="http://schemas.microsoft.com/office/word/2024/wordml/sdtformatlock" xmlns:w16se="http://schemas.microsoft.com/office/word/2015/wordml/symex" xmlns:wpg="http://schemas.microsoft.com/office/word/2010/wordprocessingGroup" xmlns:wpi="http://schemas.microsoft.com/office/word/2010/wordprocessingInk" xmlns:wne="http://schemas.microsoft.com/office/word/2006/wordml" xmlns:wps="http://schemas.microsoft.com/office/word/2010/wordprocessingShape" mc:Ignorable="w14 w15 w16se w16cid w16 w16cex w16sdtdh w16sdtfl w16du wp14">
   <w:endnote w:type="separator" w:id="-1">
     <w:p>
       <w:r>
@@ -7846,7 +8318,7 @@
 </file>
 
 <file path=word/footer1.xml><?xml version="1.0" encoding="utf-8"?>
-<w:ftr xmlns:wpc="http://schemas.microsoft.com/office/word/2010/wordprocessingCanvas" xmlns:cx="http://schemas.microsoft.com/office/drawing/2014/chartex" xmlns:cx1="http://schemas.microsoft.com/office/drawing/2015/9/8/chartex" xmlns:cx2="http://schemas.microsoft.com/office/drawing/2015/10/21/chartex" xmlns:cx3="http://schemas.microsoft.com/office/drawing/2016/5/9/chartex" xmlns:cx4="http://schemas.microsoft.com/office/drawing/2016/5/10/chartex" xmlns:cx5="http://schemas.microsoft.com/office/drawing/2016/5/11/chartex" xmlns:cx6="http://schemas.microsoft.com/office/drawing/2016/5/12/chartex" xmlns:cx7="http://schemas.microsoft.com/office/drawing/2016/5/13/chartex" xmlns:cx8="http://schemas.microsoft.com/office/drawing/2016/5/14/chartex" xmlns:mc="http://schemas.openxmlformats.org/markup-compatibility/2006" xmlns:aink="http://schemas.microsoft.com/office/drawing/2016/ink" xmlns:am3d="http://schemas.microsoft.com/office/drawing/2017/model3d" xmlns:o="urn:schemas-microsoft-com:office:office" xmlns:oel="http://schemas.microsoft.com/office/2019/extlst" xmlns:r="http://schemas.openxmlformats.org/officeDocument/2006/relationships" xmlns:m="http://schemas.openxmlformats.org/officeDocument/2006/math" xmlns:v="urn:schemas-microsoft-com:vml" xmlns:wp14="http://schemas.microsoft.com/office/word/2010/wordprocessingDrawing" xmlns:wp="http://schemas.openxmlformats.org/drawingml/2006/wordprocessingDrawing" xmlns:w10="urn:schemas-microsoft-com:office:word" xmlns:w="http://schemas.openxmlformats.org/wordprocessingml/2006/main" xmlns:w14="http://schemas.microsoft.com/office/word/2010/wordml" xmlns:w15="http://schemas.microsoft.com/office/word/2012/wordml" xmlns:w16cex="http://schemas.microsoft.com/office/word/2018/wordml/cex" xmlns:w16cid="http://schemas.microsoft.com/office/word/2016/wordml/cid" xmlns:w16="http://schemas.microsoft.com/office/word/2018/wordml" xmlns:w16du="http://schemas.microsoft.com/office/word/2023/wordml/word16du" xmlns:w16sdtdh="http://schemas.microsoft.com/office/word/2020/wordml/sdtdatahash" xmlns:w16sdtfl="http://schemas.microsoft.com/office/word/2024/wordml/sdtformatlock" xmlns:w16se="http://schemas.microsoft.com/office/word/2015/wordml/symex" xmlns:wpg="http://schemas.microsoft.com/office/word/2010/wordprocessingGroup" xmlns:wpi="http://schemas.microsoft.com/office/word/2010/wordprocessingInk" xmlns:wne="http://schemas.microsoft.com/office/word/2006/wordml" xmlns:wps="http://schemas.microsoft.com/office/word/2010/wordprocessingShape" mc:Ignorable="w14 w15 w16se w16cid w16 w16cex w16sdtdh w16sdtfl w16du wp14">
+<w:ftr xmlns:wpc="http://schemas.microsoft.com/office/word/2010/wordprocessingCanvas" xmlns:cx="http://schemas.microsoft.com/office/drawing/2014/chartex" xmlns:cx1="http://schemas.microsoft.com/office/drawing/2015/9/8/chartex" xmlns:cx2="http://schemas.microsoft.com/office/drawing/2015/10/21/chartex" xmlns:cx3="http://schemas.microsoft.com/office/drawing/2016/5/9/chartex" xmlns:cx4="http://schemas.microsoft.com/office/drawing/2016/5/10/chartex" xmlns:cx5="http://schemas.microsoft.com/office/drawing/2016/5/11/chartex" xmlns:cx6="http://schemas.microsoft.com/office/drawing/2016/5/12/chartex" xmlns:cx7="http://schemas.microsoft.com/office/drawing/2016/5/13/chartex" xmlns:cx8="http://schemas.microsoft.com/office/drawing/2016/5/14/chartex" xmlns:mc="http://schemas.openxmlformats.org/markup-compatibility/2006" xmlns:aink="http://schemas.microsoft.com/office/drawing/2016/ink" xmlns:am3d="http://schemas.microsoft.com/office/drawing/2017/model3d" xmlns:o="urn:schemas-microsoft-com:office:office" xmlns:oel="http://schemas.microsoft.com/office/2019/extlst" xmlns:r="http://schemas.openxmlformats.org/officeDocument/2006/relationships" xmlns:m="http://schemas.openxmlformats.org/officeDocument/2006/math" xmlns:v="urn:schemas-microsoft-com:vml" xmlns:wp14="http://schemas.microsoft.com/office/word/2010/wordprocessingDrawing" xmlns:wp="http://schemas.openxmlformats.org/drawingml/2006/wordprocessingDrawing" xmlns:w10="urn:schemas-microsoft-com:office:word" xmlns:w="http://schemas.openxmlformats.org/wordprocessingml/2006/main" xmlns:w14="http://schemas.microsoft.com/office/word/2010/wordml" xmlns:w15="http://schemas.microsoft.com/office/word/2012/wordml" xmlns:w16cei="http://schemas.microsoft.com/office/word/2026/wordml/cei" xmlns:w16cex="http://schemas.microsoft.com/office/word/2018/wordml/cex" xmlns:w16cid="http://schemas.microsoft.com/office/word/2016/wordml/cid" xmlns:w16="http://schemas.microsoft.com/office/word/2018/wordml" xmlns:w16du="http://schemas.microsoft.com/office/word/2023/wordml/word16du" xmlns:w16sdtdh="http://schemas.microsoft.com/office/word/2020/wordml/sdtdatahash" xmlns:w16sdtfl="http://schemas.microsoft.com/office/word/2024/wordml/sdtformatlock" xmlns:w16se="http://schemas.microsoft.com/office/word/2015/wordml/symex" xmlns:wpg="http://schemas.microsoft.com/office/word/2010/wordprocessingGroup" xmlns:wpi="http://schemas.microsoft.com/office/word/2010/wordprocessingInk" xmlns:wne="http://schemas.microsoft.com/office/word/2006/wordml" xmlns:wps="http://schemas.microsoft.com/office/word/2010/wordprocessingShape" mc:Ignorable="w14 w15 w16se w16cid w16 w16cex w16sdtdh w16sdtfl w16du wp14">
   <w:p>
     <w:pPr>
       <w:pStyle w:val="Footer"/>
@@ -7870,7 +8342,7 @@
 </file>
 
 <file path=word/footer2.xml><?xml version="1.0" encoding="utf-8"?>
-<w:ftr xmlns:wpc="http://schemas.microsoft.com/office/word/2010/wordprocessingCanvas" xmlns:cx="http://schemas.microsoft.com/office/drawing/2014/chartex" xmlns:cx1="http://schemas.microsoft.com/office/drawing/2015/9/8/chartex" xmlns:cx2="http://schemas.microsoft.com/office/drawing/2015/10/21/chartex" xmlns:cx3="http://schemas.microsoft.com/office/drawing/2016/5/9/chartex" xmlns:cx4="http://schemas.microsoft.com/office/drawing/2016/5/10/chartex" xmlns:cx5="http://schemas.microsoft.com/office/drawing/2016/5/11/chartex" xmlns:cx6="http://schemas.microsoft.com/office/drawing/2016/5/12/chartex" xmlns:cx7="http://schemas.microsoft.com/office/drawing/2016/5/13/chartex" xmlns:cx8="http://schemas.microsoft.com/office/drawing/2016/5/14/chartex" xmlns:mc="http://schemas.openxmlformats.org/markup-compatibility/2006" xmlns:aink="http://schemas.microsoft.com/office/drawing/2016/ink" xmlns:am3d="http://schemas.microsoft.com/office/drawing/2017/model3d" xmlns:o="urn:schemas-microsoft-com:office:office" xmlns:oel="http://schemas.microsoft.com/office/2019/extlst" xmlns:r="http://schemas.openxmlformats.org/officeDocument/2006/relationships" xmlns:m="http://schemas.openxmlformats.org/officeDocument/2006/math" xmlns:v="urn:schemas-microsoft-com:vml" xmlns:wp14="http://schemas.microsoft.com/office/word/2010/wordprocessingDrawing" xmlns:wp="http://schemas.openxmlformats.org/drawingml/2006/wordprocessingDrawing" xmlns:w10="urn:schemas-microsoft-com:office:word" xmlns:w="http://schemas.openxmlformats.org/wordprocessingml/2006/main" xmlns:w14="http://schemas.microsoft.com/office/word/2010/wordml" xmlns:w15="http://schemas.microsoft.com/office/word/2012/wordml" xmlns:w16cex="http://schemas.microsoft.com/office/word/2018/wordml/cex" xmlns:w16cid="http://schemas.microsoft.com/office/word/2016/wordml/cid" xmlns:w16="http://schemas.microsoft.com/office/word/2018/wordml" xmlns:w16du="http://schemas.microsoft.com/office/word/2023/wordml/word16du" xmlns:w16sdtdh="http://schemas.microsoft.com/office/word/2020/wordml/sdtdatahash" xmlns:w16sdtfl="http://schemas.microsoft.com/office/word/2024/wordml/sdtformatlock" xmlns:w16se="http://schemas.microsoft.com/office/word/2015/wordml/symex" xmlns:wpg="http://schemas.microsoft.com/office/word/2010/wordprocessingGroup" xmlns:wpi="http://schemas.microsoft.com/office/word/2010/wordprocessingInk" xmlns:wne="http://schemas.microsoft.com/office/word/2006/wordml" xmlns:wps="http://schemas.microsoft.com/office/word/2010/wordprocessingShape" mc:Ignorable="w14 w15 w16se w16cid w16 w16cex w16sdtdh w16sdtfl w16du wp14">
+<w:ftr xmlns:wpc="http://schemas.microsoft.com/office/word/2010/wordprocessingCanvas" xmlns:cx="http://schemas.microsoft.com/office/drawing/2014/chartex" xmlns:cx1="http://schemas.microsoft.com/office/drawing/2015/9/8/chartex" xmlns:cx2="http://schemas.microsoft.com/office/drawing/2015/10/21/chartex" xmlns:cx3="http://schemas.microsoft.com/office/drawing/2016/5/9/chartex" xmlns:cx4="http://schemas.microsoft.com/office/drawing/2016/5/10/chartex" xmlns:cx5="http://schemas.microsoft.com/office/drawing/2016/5/11/chartex" xmlns:cx6="http://schemas.microsoft.com/office/drawing/2016/5/12/chartex" xmlns:cx7="http://schemas.microsoft.com/office/drawing/2016/5/13/chartex" xmlns:cx8="http://schemas.microsoft.com/office/drawing/2016/5/14/chartex" xmlns:mc="http://schemas.openxmlformats.org/markup-compatibility/2006" xmlns:aink="http://schemas.microsoft.com/office/drawing/2016/ink" xmlns:am3d="http://schemas.microsoft.com/office/drawing/2017/model3d" xmlns:o="urn:schemas-microsoft-com:office:office" xmlns:oel="http://schemas.microsoft.com/office/2019/extlst" xmlns:r="http://schemas.openxmlformats.org/officeDocument/2006/relationships" xmlns:m="http://schemas.openxmlformats.org/officeDocument/2006/math" xmlns:v="urn:schemas-microsoft-com:vml" xmlns:wp14="http://schemas.microsoft.com/office/word/2010/wordprocessingDrawing" xmlns:wp="http://schemas.openxmlformats.org/drawingml/2006/wordprocessingDrawing" xmlns:w10="urn:schemas-microsoft-com:office:word" xmlns:w="http://schemas.openxmlformats.org/wordprocessingml/2006/main" xmlns:w14="http://schemas.microsoft.com/office/word/2010/wordml" xmlns:w15="http://schemas.microsoft.com/office/word/2012/wordml" xmlns:w16cei="http://schemas.microsoft.com/office/word/2026/wordml/cei" xmlns:w16cex="http://schemas.microsoft.com/office/word/2018/wordml/cex" xmlns:w16cid="http://schemas.microsoft.com/office/word/2016/wordml/cid" xmlns:w16="http://schemas.microsoft.com/office/word/2018/wordml" xmlns:w16du="http://schemas.microsoft.com/office/word/2023/wordml/word16du" xmlns:w16sdtdh="http://schemas.microsoft.com/office/word/2020/wordml/sdtdatahash" xmlns:w16sdtfl="http://schemas.microsoft.com/office/word/2024/wordml/sdtformatlock" xmlns:w16se="http://schemas.microsoft.com/office/word/2015/wordml/symex" xmlns:wpg="http://schemas.microsoft.com/office/word/2010/wordprocessingGroup" xmlns:wpi="http://schemas.microsoft.com/office/word/2010/wordprocessingInk" xmlns:wne="http://schemas.microsoft.com/office/word/2006/wordml" xmlns:wps="http://schemas.microsoft.com/office/word/2010/wordprocessingShape" mc:Ignorable="w14 w15 w16se w16cid w16 w16cex w16sdtdh w16sdtfl w16du wp14">
   <w:sdt>
     <w:sdtPr>
       <w:rPr>
@@ -7960,7 +8432,7 @@
 </file>
 
 <file path=word/footnotes.xml><?xml version="1.0" encoding="utf-8"?>
-<w:footnotes xmlns:wpc="http://schemas.microsoft.com/office/word/2010/wordprocessingCanvas" xmlns:cx="http://schemas.microsoft.com/office/drawing/2014/chartex" xmlns:cx1="http://schemas.microsoft.com/office/drawing/2015/9/8/chartex" xmlns:cx2="http://schemas.microsoft.com/office/drawing/2015/10/21/chartex" xmlns:cx3="http://schemas.microsoft.com/office/drawing/2016/5/9/chartex" xmlns:cx4="http://schemas.microsoft.com/office/drawing/2016/5/10/chartex" xmlns:cx5="http://schemas.microsoft.com/office/drawing/2016/5/11/chartex" xmlns:cx6="http://schemas.microsoft.com/office/drawing/2016/5/12/chartex" xmlns:cx7="http://schemas.microsoft.com/office/drawing/2016/5/13/chartex" xmlns:cx8="http://schemas.microsoft.com/office/drawing/2016/5/14/chartex" xmlns:mc="http://schemas.openxmlformats.org/markup-compatibility/2006" xmlns:aink="http://schemas.microsoft.com/office/drawing/2016/ink" xmlns:am3d="http://schemas.microsoft.com/office/drawing/2017/model3d" xmlns:o="urn:schemas-microsoft-com:office:office" xmlns:oel="http://schemas.microsoft.com/office/2019/extlst" xmlns:r="http://schemas.openxmlformats.org/officeDocument/2006/relationships" xmlns:m="http://schemas.openxmlformats.org/officeDocument/2006/math" xmlns:v="urn:schemas-microsoft-com:vml" xmlns:wp14="http://schemas.microsoft.com/office/word/2010/wordprocessingDrawing" xmlns:wp="http://schemas.openxmlformats.org/drawingml/2006/wordprocessingDrawing" xmlns:w10="urn:schemas-microsoft-com:office:word" xmlns:w="http://schemas.openxmlformats.org/wordprocessingml/2006/main" xmlns:w14="http://schemas.microsoft.com/office/word/2010/wordml" xmlns:w15="http://schemas.microsoft.com/office/word/2012/wordml" xmlns:w16cex="http://schemas.microsoft.com/office/word/2018/wordml/cex" xmlns:w16cid="http://schemas.microsoft.com/office/word/2016/wordml/cid" xmlns:w16="http://schemas.microsoft.com/office/word/2018/wordml" xmlns:w16du="http://schemas.microsoft.com/office/word/2023/wordml/word16du" xmlns:w16sdtdh="http://schemas.microsoft.com/office/word/2020/wordml/sdtdatahash" xmlns:w16sdtfl="http://schemas.microsoft.com/office/word/2024/wordml/sdtformatlock" xmlns:w16se="http://schemas.microsoft.com/office/word/2015/wordml/symex" xmlns:wpg="http://schemas.microsoft.com/office/word/2010/wordprocessingGroup" xmlns:wpi="http://schemas.microsoft.com/office/word/2010/wordprocessingInk" xmlns:wne="http://schemas.microsoft.com/office/word/2006/wordml" xmlns:wps="http://schemas.microsoft.com/office/word/2010/wordprocessingShape" mc:Ignorable="w14 w15 w16se w16cid w16 w16cex w16sdtdh w16sdtfl w16du wp14">
+<w:footnotes xmlns:wpc="http://schemas.microsoft.com/office/word/2010/wordprocessingCanvas" xmlns:cx="http://schemas.microsoft.com/office/drawing/2014/chartex" xmlns:cx1="http://schemas.microsoft.com/office/drawing/2015/9/8/chartex" xmlns:cx2="http://schemas.microsoft.com/office/drawing/2015/10/21/chartex" xmlns:cx3="http://schemas.microsoft.com/office/drawing/2016/5/9/chartex" xmlns:cx4="http://schemas.microsoft.com/office/drawing/2016/5/10/chartex" xmlns:cx5="http://schemas.microsoft.com/office/drawing/2016/5/11/chartex" xmlns:cx6="http://schemas.microsoft.com/office/drawing/2016/5/12/chartex" xmlns:cx7="http://schemas.microsoft.com/office/drawing/2016/5/13/chartex" xmlns:cx8="http://schemas.microsoft.com/office/drawing/2016/5/14/chartex" xmlns:mc="http://schemas.openxmlformats.org/markup-compatibility/2006" xmlns:aink="http://schemas.microsoft.com/office/drawing/2016/ink" xmlns:am3d="http://schemas.microsoft.com/office/drawing/2017/model3d" xmlns:o="urn:schemas-microsoft-com:office:office" xmlns:oel="http://schemas.microsoft.com/office/2019/extlst" xmlns:r="http://schemas.openxmlformats.org/officeDocument/2006/relationships" xmlns:m="http://schemas.openxmlformats.org/officeDocument/2006/math" xmlns:v="urn:schemas-microsoft-com:vml" xmlns:wp14="http://schemas.microsoft.com/office/word/2010/wordprocessingDrawing" xmlns:wp="http://schemas.openxmlformats.org/drawingml/2006/wordprocessingDrawing" xmlns:w10="urn:schemas-microsoft-com:office:word" xmlns:w="http://schemas.openxmlformats.org/wordprocessingml/2006/main" xmlns:w14="http://schemas.microsoft.com/office/word/2010/wordml" xmlns:w15="http://schemas.microsoft.com/office/word/2012/wordml" xmlns:w16cei="http://schemas.microsoft.com/office/word/2026/wordml/cei" xmlns:w16cex="http://schemas.microsoft.com/office/word/2018/wordml/cex" xmlns:w16cid="http://schemas.microsoft.com/office/word/2016/wordml/cid" xmlns:w16="http://schemas.microsoft.com/office/word/2018/wordml" xmlns:w16du="http://schemas.microsoft.com/office/word/2023/wordml/word16du" xmlns:w16sdtdh="http://schemas.microsoft.com/office/word/2020/wordml/sdtdatahash" xmlns:w16sdtfl="http://schemas.microsoft.com/office/word/2024/wordml/sdtformatlock" xmlns:w16se="http://schemas.microsoft.com/office/word/2015/wordml/symex" xmlns:wpg="http://schemas.microsoft.com/office/word/2010/wordprocessingGroup" xmlns:wpi="http://schemas.microsoft.com/office/word/2010/wordprocessingInk" xmlns:wne="http://schemas.microsoft.com/office/word/2006/wordml" xmlns:wps="http://schemas.microsoft.com/office/word/2010/wordprocessingShape" mc:Ignorable="w14 w15 w16se w16cid w16 w16cex w16sdtdh w16sdtfl w16du wp14">
   <w:footnote w:type="separator" w:id="-1">
     <w:p>
       <w:r>
@@ -7979,7 +8451,7 @@
 </file>
 
 <file path=word/numbering.xml><?xml version="1.0" encoding="utf-8"?>
-<w:numbering xmlns:wpc="http://schemas.microsoft.com/office/word/2010/wordprocessingCanvas" xmlns:cx="http://schemas.microsoft.com/office/drawing/2014/chartex" xmlns:cx1="http://schemas.microsoft.com/office/drawing/2015/9/8/chartex" xmlns:cx2="http://schemas.microsoft.com/office/drawing/2015/10/21/chartex" xmlns:cx3="http://schemas.microsoft.com/office/drawing/2016/5/9/chartex" xmlns:cx4="http://schemas.microsoft.com/office/drawing/2016/5/10/chartex" xmlns:cx5="http://schemas.microsoft.com/office/drawing/2016/5/11/chartex" xmlns:cx6="http://schemas.microsoft.com/office/drawing/2016/5/12/chartex" xmlns:cx7="http://schemas.microsoft.com/office/drawing/2016/5/13/chartex" xmlns:cx8="http://schemas.microsoft.com/office/drawing/2016/5/14/chartex" xmlns:mc="http://schemas.openxmlformats.org/markup-compatibility/2006" xmlns:aink="http://schemas.microsoft.com/office/drawing/2016/ink" xmlns:am3d="http://schemas.microsoft.com/office/drawing/2017/model3d" xmlns:o="urn:schemas-microsoft-com:office:office" xmlns:oel="http://schemas.microsoft.com/office/2019/extlst" xmlns:r="http://schemas.openxmlformats.org/officeDocument/2006/relationships" xmlns:m="http://schemas.openxmlformats.org/officeDocument/2006/math" xmlns:v="urn:schemas-microsoft-com:vml" xmlns:wp14="http://schemas.microsoft.com/office/word/2010/wordprocessingDrawing" xmlns:wp="http://schemas.openxmlformats.org/drawingml/2006/wordprocessingDrawing" xmlns:w10="urn:schemas-microsoft-com:office:word" xmlns:w="http://schemas.openxmlformats.org/wordprocessingml/2006/main" xmlns:w14="http://schemas.microsoft.com/office/word/2010/wordml" xmlns:w15="http://schemas.microsoft.com/office/word/2012/wordml" xmlns:w16cex="http://schemas.microsoft.com/office/word/2018/wordml/cex" xmlns:w16cid="http://schemas.microsoft.com/office/word/2016/wordml/cid" xmlns:w16="http://schemas.microsoft.com/office/word/2018/wordml" xmlns:w16du="http://schemas.microsoft.com/office/word/2023/wordml/word16du" xmlns:w16sdtdh="http://schemas.microsoft.com/office/word/2020/wordml/sdtdatahash" xmlns:w16sdtfl="http://schemas.microsoft.com/office/word/2024/wordml/sdtformatlock" xmlns:w16se="http://schemas.microsoft.com/office/word/2015/wordml/symex" xmlns:wpg="http://schemas.microsoft.com/office/word/2010/wordprocessingGroup" xmlns:wpi="http://schemas.microsoft.com/office/word/2010/wordprocessingInk" xmlns:wne="http://schemas.microsoft.com/office/word/2006/wordml" xmlns:wps="http://schemas.microsoft.com/office/word/2010/wordprocessingShape" mc:Ignorable="w14 w15 w16se w16cid w16 w16cex w16sdtdh w16sdtfl w16du wp14">
+<w:numbering xmlns:wpc="http://schemas.microsoft.com/office/word/2010/wordprocessingCanvas" xmlns:cx="http://schemas.microsoft.com/office/drawing/2014/chartex" xmlns:cx1="http://schemas.microsoft.com/office/drawing/2015/9/8/chartex" xmlns:cx2="http://schemas.microsoft.com/office/drawing/2015/10/21/chartex" xmlns:cx3="http://schemas.microsoft.com/office/drawing/2016/5/9/chartex" xmlns:cx4="http://schemas.microsoft.com/office/drawing/2016/5/10/chartex" xmlns:cx5="http://schemas.microsoft.com/office/drawing/2016/5/11/chartex" xmlns:cx6="http://schemas.microsoft.com/office/drawing/2016/5/12/chartex" xmlns:cx7="http://schemas.microsoft.com/office/drawing/2016/5/13/chartex" xmlns:cx8="http://schemas.microsoft.com/office/drawing/2016/5/14/chartex" xmlns:mc="http://schemas.openxmlformats.org/markup-compatibility/2006" xmlns:aink="http://schemas.microsoft.com/office/drawing/2016/ink" xmlns:am3d="http://schemas.microsoft.com/office/drawing/2017/model3d" xmlns:o="urn:schemas-microsoft-com:office:office" xmlns:oel="http://schemas.microsoft.com/office/2019/extlst" xmlns:r="http://schemas.openxmlformats.org/officeDocument/2006/relationships" xmlns:m="http://schemas.openxmlformats.org/officeDocument/2006/math" xmlns:v="urn:schemas-microsoft-com:vml" xmlns:wp14="http://schemas.microsoft.com/office/word/2010/wordprocessingDrawing" xmlns:wp="http://schemas.openxmlformats.org/drawingml/2006/wordprocessingDrawing" xmlns:w10="urn:schemas-microsoft-com:office:word" xmlns:w="http://schemas.openxmlformats.org/wordprocessingml/2006/main" xmlns:w14="http://schemas.microsoft.com/office/word/2010/wordml" xmlns:w15="http://schemas.microsoft.com/office/word/2012/wordml" xmlns:w16cei="http://schemas.microsoft.com/office/word/2026/wordml/cei" xmlns:w16cex="http://schemas.microsoft.com/office/word/2018/wordml/cex" xmlns:w16cid="http://schemas.microsoft.com/office/word/2016/wordml/cid" xmlns:w16="http://schemas.microsoft.com/office/word/2018/wordml" xmlns:w16du="http://schemas.microsoft.com/office/word/2023/wordml/word16du" xmlns:w16sdtdh="http://schemas.microsoft.com/office/word/2020/wordml/sdtdatahash" xmlns:w16sdtfl="http://schemas.microsoft.com/office/word/2024/wordml/sdtformatlock" xmlns:w16se="http://schemas.microsoft.com/office/word/2015/wordml/symex" xmlns:wpg="http://schemas.microsoft.com/office/word/2010/wordprocessingGroup" xmlns:wpi="http://schemas.microsoft.com/office/word/2010/wordprocessingInk" xmlns:wne="http://schemas.microsoft.com/office/word/2006/wordml" xmlns:wps="http://schemas.microsoft.com/office/word/2010/wordprocessingShape" mc:Ignorable="w14 w15 w16se w16cid w16 w16cex w16sdtdh w16sdtfl w16du wp14">
   <w:abstractNum w:abstractNumId="0" w15:restartNumberingAfterBreak="0">
     <w:nsid w:val="03E34318"/>
     <w:multiLevelType w:val="multilevel"/>

</xml_diff>

<commit_message>
updated DFD as per instruction by Keyur Sir
</commit_message>
<xml_diff>
--- a/Presentation_Reports/Group_09_Progress_report_2.docx
+++ b/Presentation_Reports/Group_09_Progress_report_2.docx
@@ -1613,16 +1613,16 @@
         </w:rPr>
         <w:lastRenderedPageBreak/>
         <w:drawing>
-          <wp:anchor distT="0" distB="0" distL="114300" distR="114300" simplePos="0" relativeHeight="251747328" behindDoc="0" locked="0" layoutInCell="1" allowOverlap="1" wp14:anchorId="70D1BBE0" wp14:editId="12D4863E">
+          <wp:anchor distT="0" distB="0" distL="114300" distR="114300" simplePos="0" relativeHeight="251747328" behindDoc="0" locked="0" layoutInCell="1" allowOverlap="1" wp14:anchorId="70D1BBE0" wp14:editId="71FFC219">
             <wp:simplePos x="0" y="0"/>
             <wp:positionH relativeFrom="margin">
-              <wp:posOffset>342900</wp:posOffset>
+              <wp:posOffset>346710</wp:posOffset>
             </wp:positionH>
             <wp:positionV relativeFrom="paragraph">
-              <wp:posOffset>2358390</wp:posOffset>
+              <wp:posOffset>2362200</wp:posOffset>
             </wp:positionV>
-            <wp:extent cx="5010150" cy="5692140"/>
-            <wp:effectExtent l="0" t="0" r="0" b="0"/>
+            <wp:extent cx="4834255" cy="5588000"/>
+            <wp:effectExtent l="0" t="0" r="4445" b="0"/>
             <wp:wrapTopAndBottom/>
             <wp:docPr id="1828441017" name="Picture 25"/>
             <wp:cNvGraphicFramePr>
@@ -1643,7 +1643,7 @@
                         </a:ext>
                       </a:extLst>
                     </a:blip>
-                    <a:srcRect l="-340" t="410" r="340" b="-1268"/>
+                    <a:srcRect t="2467" r="3507" b="4206"/>
                     <a:stretch>
                       <a:fillRect/>
                     </a:stretch>
@@ -1651,7 +1651,7 @@
                   <pic:spPr bwMode="auto">
                     <a:xfrm>
                       <a:off x="0" y="0"/>
-                      <a:ext cx="5010150" cy="5692140"/>
+                      <a:ext cx="4834255" cy="5588000"/>
                     </a:xfrm>
                     <a:prstGeom prst="rect">
                       <a:avLst/>
@@ -1682,18 +1682,18 @@
           <w:noProof/>
         </w:rPr>
         <w:drawing>
-          <wp:anchor distT="0" distB="0" distL="114300" distR="114300" simplePos="0" relativeHeight="251744256" behindDoc="0" locked="0" layoutInCell="1" allowOverlap="1" wp14:anchorId="5AB6A515" wp14:editId="716F427F">
+          <wp:anchor distT="0" distB="0" distL="114300" distR="114300" simplePos="0" relativeHeight="251749376" behindDoc="0" locked="0" layoutInCell="1" allowOverlap="1" wp14:anchorId="4F759EEF" wp14:editId="141C92BC">
             <wp:simplePos x="0" y="0"/>
-            <wp:positionH relativeFrom="margin">
-              <wp:posOffset>-497840</wp:posOffset>
+            <wp:positionH relativeFrom="column">
+              <wp:posOffset>0</wp:posOffset>
             </wp:positionH>
             <wp:positionV relativeFrom="paragraph">
-              <wp:posOffset>390525</wp:posOffset>
+              <wp:posOffset>445770</wp:posOffset>
             </wp:positionV>
-            <wp:extent cx="6735356" cy="1809750"/>
-            <wp:effectExtent l="0" t="0" r="8890" b="0"/>
+            <wp:extent cx="5731510" cy="1832610"/>
+            <wp:effectExtent l="0" t="0" r="2540" b="0"/>
             <wp:wrapTopAndBottom/>
-            <wp:docPr id="1276330230" name="Picture 25"/>
+            <wp:docPr id="512472638" name="Picture 1"/>
             <wp:cNvGraphicFramePr>
               <a:graphicFrameLocks xmlns:a="http://schemas.openxmlformats.org/drawingml/2006/main" noChangeAspect="1"/>
             </wp:cNvGraphicFramePr>
@@ -1701,10 +1701,10 @@
               <a:graphicData uri="http://schemas.openxmlformats.org/drawingml/2006/picture">
                 <pic:pic xmlns:pic="http://schemas.openxmlformats.org/drawingml/2006/picture">
                   <pic:nvPicPr>
-                    <pic:cNvPr id="1276330230" name="Picture 25"/>
+                    <pic:cNvPr id="512472638" name=""/>
                     <pic:cNvPicPr/>
                   </pic:nvPicPr>
-                  <pic:blipFill rotWithShape="1">
+                  <pic:blipFill>
                     <a:blip r:embed="rId14">
                       <a:extLst>
                         <a:ext uri="{28A0092B-C50C-407E-A947-70E740481C1C}">
@@ -1712,37 +1712,22 @@
                         </a:ext>
                       </a:extLst>
                     </a:blip>
-                    <a:srcRect l="2842" r="2330"/>
                     <a:stretch>
                       <a:fillRect/>
                     </a:stretch>
                   </pic:blipFill>
-                  <pic:spPr bwMode="auto">
+                  <pic:spPr>
                     <a:xfrm>
                       <a:off x="0" y="0"/>
-                      <a:ext cx="6735356" cy="1809750"/>
+                      <a:ext cx="5731510" cy="1832610"/>
                     </a:xfrm>
                     <a:prstGeom prst="rect">
                       <a:avLst/>
                     </a:prstGeom>
-                    <a:ln>
-                      <a:noFill/>
-                    </a:ln>
-                    <a:extLst>
-                      <a:ext uri="{53640926-AAD7-44D8-BBD7-CCE9431645EC}">
-                        <a14:shadowObscured xmlns:a14="http://schemas.microsoft.com/office/drawing/2010/main"/>
-                      </a:ext>
-                    </a:extLst>
                   </pic:spPr>
                 </pic:pic>
               </a:graphicData>
             </a:graphic>
-            <wp14:sizeRelH relativeFrom="page">
-              <wp14:pctWidth>0</wp14:pctWidth>
-            </wp14:sizeRelH>
-            <wp14:sizeRelV relativeFrom="page">
-              <wp14:pctHeight>0</wp14:pctHeight>
-            </wp14:sizeRelV>
           </wp:anchor>
         </w:drawing>
       </w:r>
@@ -8138,7 +8123,7 @@
           <w:noProof/>
         </w:rPr>
         <w:drawing>
-          <wp:anchor distT="0" distB="0" distL="114300" distR="114300" simplePos="0" relativeHeight="251715584" behindDoc="0" locked="0" layoutInCell="1" allowOverlap="1" wp14:anchorId="643AC39F" wp14:editId="4D395FA0">
+          <wp:anchor distT="0" distB="0" distL="114300" distR="114300" simplePos="0" relativeHeight="251715584" behindDoc="0" locked="0" layoutInCell="1" allowOverlap="1" wp14:anchorId="643AC39F" wp14:editId="7BC61FE1">
             <wp:simplePos x="0" y="0"/>
             <wp:positionH relativeFrom="margin">
               <wp:posOffset>2145665</wp:posOffset>
@@ -8260,23 +8245,7 @@
             <w:i/>
             <w:iCs/>
           </w:rPr>
-          <w:t>https://robu-prod-medi</w:t>
-        </w:r>
-        <w:r>
-          <w:rPr>
-            <w:rStyle w:val="Hyperlink"/>
-            <w:i/>
-            <w:iCs/>
-          </w:rPr>
-          <w:t>a</w:t>
-        </w:r>
-        <w:r>
-          <w:rPr>
-            <w:rStyle w:val="Hyperlink"/>
-            <w:i/>
-            <w:iCs/>
-          </w:rPr>
-          <w:t>.s3.ap-south-1.amazonaws.com/products/attachments/Eq0SH3f4IQXoK1XIIEUwK8F78xItwCXGfefhfO3I.pdf</w:t>
+          <w:t>https://robu-prod-media.s3.ap-south-1.amazonaws.com/products/attachments/Eq0SH3f4IQXoK1XIIEUwK8F78xItwCXGfefhfO3I.pdf</w:t>
         </w:r>
       </w:hyperlink>
     </w:p>

</xml_diff>